<commit_message>
docs: unify diagram and document palette with the app theme
ERD, use-case and architecture PNGs rebuilt from HTML/SVG with the
Passport tokens (paper, navy, coral, stamp-red, ink-muted headers per
entity/layer) instead of the old teal-green-purple set. PRD XML
recolored in place: slate->ink #2D2D2D, cream->paper #F5F2E9,
teal->navy #1A237E, teal-soft->navy-soft. UI/UX doc default text
black softened to ink and stale blue accents to navy. Content,
relations and class lists unchanged (previously verified).

Co-Authored-By: Claude Code <noreply@anthropic.com>
</commit_message>
<xml_diff>
--- a/docs/Detail_Desain_UIUX.docx
+++ b/docs/Detail_Desain_UIUX.docx
@@ -3508,7 +3508,7 @@
       <w:bCs/>
       <w:i/>
       <w:iCs/>
-      <w:color w:val="4F81BD" w:themeColor="accent1"/>
+      <w:color w:val="1A237E" w:themeColor="accent1"/>
     </w:rPr>
   </w:style>
   <w:style w:type="paragraph" w:styleId="Heading5">
@@ -3596,7 +3596,7 @@
     </w:pPr>
     <w:rPr>
       <w:rFonts w:asciiTheme="majorHAnsi" w:eastAsiaTheme="majorEastAsia" w:hAnsiTheme="majorHAnsi" w:cstheme="majorBidi"/>
-      <w:color w:val="4F81BD" w:themeColor="accent1"/>
+      <w:color w:val="1A237E" w:themeColor="accent1"/>
       <w:sz w:val="20"/>
       <w:szCs w:val="20"/>
     </w:rPr>
@@ -3687,7 +3687,7 @@
       <w:rFonts w:asciiTheme="majorHAnsi" w:eastAsiaTheme="majorEastAsia" w:hAnsiTheme="majorHAnsi" w:cstheme="majorBidi"/>
       <w:b/>
       <w:bCs/>
-      <w:color w:val="4F81BD" w:themeColor="accent1"/>
+      <w:color w:val="1A237E" w:themeColor="accent1"/>
       <w:sz w:val="26"/>
       <w:szCs w:val="26"/>
     </w:rPr>
@@ -3702,7 +3702,7 @@
       <w:rFonts w:asciiTheme="majorHAnsi" w:eastAsiaTheme="majorEastAsia" w:hAnsiTheme="majorHAnsi" w:cstheme="majorBidi"/>
       <w:b/>
       <w:bCs/>
-      <w:color w:val="4F81BD" w:themeColor="accent1"/>
+      <w:color w:val="1A237E" w:themeColor="accent1"/>
     </w:rPr>
   </w:style>
   <w:style w:type="paragraph" w:styleId="Title">
@@ -3715,7 +3715,7 @@
     <w:rsid w:val="00FC693F"/>
     <w:pPr>
       <w:pBdr>
-        <w:bottom w:val="single" w:sz="8" w:space="4" w:color="4F81BD" w:themeColor="accent1"/>
+        <w:bottom w:val="single" w:sz="8" w:space="4" w:color="1A237E" w:themeColor="accent1"/>
       </w:pBdr>
       <w:spacing w:after="300" w:line="240" w:lineRule="auto"/>
       <w:contextualSpacing/>
@@ -3761,7 +3761,7 @@
       <w:rFonts w:asciiTheme="majorHAnsi" w:eastAsiaTheme="majorEastAsia" w:hAnsiTheme="majorHAnsi" w:cstheme="majorBidi"/>
       <w:i/>
       <w:iCs/>
-      <w:color w:val="4F81BD" w:themeColor="accent1"/>
+      <w:color w:val="1A237E" w:themeColor="accent1"/>
       <w:spacing w:val="15"/>
       <w:sz w:val="24"/>
       <w:szCs w:val="24"/>
@@ -3777,7 +3777,7 @@
       <w:rFonts w:asciiTheme="majorHAnsi" w:eastAsiaTheme="majorEastAsia" w:hAnsiTheme="majorHAnsi" w:cstheme="majorBidi"/>
       <w:i/>
       <w:iCs/>
-      <w:color w:val="4F81BD" w:themeColor="accent1"/>
+      <w:color w:val="1A237E" w:themeColor="accent1"/>
       <w:spacing w:val="15"/>
       <w:sz w:val="24"/>
       <w:szCs w:val="24"/>
@@ -4049,7 +4049,7 @@
     <w:rPr>
       <w:i/>
       <w:iCs/>
-      <w:color w:val="000000" w:themeColor="text1"/>
+      <w:color w:val="2D2D2D" w:themeColor="text1"/>
     </w:rPr>
   </w:style>
   <w:style w:type="character" w:customStyle="1" w:styleId="QuoteChar">
@@ -4061,7 +4061,7 @@
     <w:rPr>
       <w:i/>
       <w:iCs/>
-      <w:color w:val="000000" w:themeColor="text1"/>
+      <w:color w:val="2D2D2D" w:themeColor="text1"/>
     </w:rPr>
   </w:style>
   <w:style w:type="character" w:customStyle="1" w:styleId="Heading4Char">
@@ -4077,7 +4077,7 @@
       <w:bCs/>
       <w:i/>
       <w:iCs/>
-      <w:color w:val="4F81BD" w:themeColor="accent1"/>
+      <w:color w:val="1A237E" w:themeColor="accent1"/>
     </w:rPr>
   </w:style>
   <w:style w:type="character" w:customStyle="1" w:styleId="Heading5Char">
@@ -4129,7 +4129,7 @@
     <w:rsid w:val="00FC693F"/>
     <w:rPr>
       <w:rFonts w:asciiTheme="majorHAnsi" w:eastAsiaTheme="majorEastAsia" w:hAnsiTheme="majorHAnsi" w:cstheme="majorBidi"/>
-      <w:color w:val="4F81BD" w:themeColor="accent1"/>
+      <w:color w:val="1A237E" w:themeColor="accent1"/>
       <w:sz w:val="20"/>
       <w:szCs w:val="20"/>
     </w:rPr>
@@ -4165,7 +4165,7 @@
     <w:rPr>
       <w:b/>
       <w:bCs/>
-      <w:color w:val="4F81BD" w:themeColor="accent1"/>
+      <w:color w:val="1A237E" w:themeColor="accent1"/>
       <w:sz w:val="18"/>
       <w:szCs w:val="18"/>
     </w:rPr>
@@ -4202,7 +4202,7 @@
     <w:rsid w:val="00FC693F"/>
     <w:pPr>
       <w:pBdr>
-        <w:bottom w:val="single" w:sz="4" w:space="4" w:color="4F81BD" w:themeColor="accent1"/>
+        <w:bottom w:val="single" w:sz="4" w:space="4" w:color="1A237E" w:themeColor="accent1"/>
       </w:pBdr>
       <w:spacing w:before="200" w:after="280"/>
       <w:ind w:left="936" w:right="936"/>
@@ -4212,7 +4212,7 @@
       <w:bCs/>
       <w:i/>
       <w:iCs/>
-      <w:color w:val="4F81BD" w:themeColor="accent1"/>
+      <w:color w:val="1A237E" w:themeColor="accent1"/>
     </w:rPr>
   </w:style>
   <w:style w:type="character" w:customStyle="1" w:styleId="IntenseQuoteChar">
@@ -4226,7 +4226,7 @@
       <w:bCs/>
       <w:i/>
       <w:iCs/>
-      <w:color w:val="4F81BD" w:themeColor="accent1"/>
+      <w:color w:val="1A237E" w:themeColor="accent1"/>
     </w:rPr>
   </w:style>
   <w:style w:type="character" w:styleId="SubtleEmphasis">
@@ -4252,7 +4252,7 @@
       <w:bCs/>
       <w:i/>
       <w:iCs/>
-      <w:color w:val="4F81BD" w:themeColor="accent1"/>
+      <w:color w:val="1A237E" w:themeColor="accent1"/>
     </w:rPr>
   </w:style>
   <w:style w:type="character" w:styleId="SubtleReference">
@@ -4343,7 +4343,7 @@
       <w:spacing w:after="0" w:line="240" w:lineRule="auto"/>
     </w:pPr>
     <w:rPr>
-      <w:color w:val="000000" w:themeColor="text1" w:themeShade="BF"/>
+      <w:color w:val="2D2D2D" w:themeColor="text1" w:themeShade="BF"/>
     </w:rPr>
     <w:tblPr>
       <w:tblStyleRowBandSize w:val="1"/>
@@ -4453,8 +4453,8 @@
       <w:tblStyleColBandSize w:val="1"/>
       <w:tblInd w:w="0" w:type="dxa"/>
       <w:tblBorders>
-        <w:top w:val="single" w:sz="8" w:space="0" w:color="4F81BD" w:themeColor="accent1"/>
-        <w:bottom w:val="single" w:sz="8" w:space="0" w:color="4F81BD" w:themeColor="accent1"/>
+        <w:top w:val="single" w:sz="8" w:space="0" w:color="1A237E" w:themeColor="accent1"/>
+        <w:bottom w:val="single" w:sz="8" w:space="0" w:color="1A237E" w:themeColor="accent1"/>
       </w:tblBorders>
       <w:tblCellMar>
         <w:top w:w="0" w:type="dxa"/>
@@ -4474,9 +4474,9 @@
       <w:tblPr/>
       <w:tcPr>
         <w:tcBorders>
-          <w:top w:val="single" w:sz="8" w:space="0" w:color="4F81BD" w:themeColor="accent1"/>
-          <w:left w:val="nil"/>
-          <w:bottom w:val="single" w:sz="8" w:space="0" w:color="4F81BD" w:themeColor="accent1"/>
+          <w:top w:val="single" w:sz="8" w:space="0" w:color="1A237E" w:themeColor="accent1"/>
+          <w:left w:val="nil"/>
+          <w:bottom w:val="single" w:sz="8" w:space="0" w:color="1A237E" w:themeColor="accent1"/>
           <w:right w:val="nil"/>
           <w:insideH w:val="nil"/>
           <w:insideV w:val="nil"/>
@@ -4494,9 +4494,9 @@
       <w:tblPr/>
       <w:tcPr>
         <w:tcBorders>
-          <w:top w:val="single" w:sz="8" w:space="0" w:color="4F81BD" w:themeColor="accent1"/>
-          <w:left w:val="nil"/>
-          <w:bottom w:val="single" w:sz="8" w:space="0" w:color="4F81BD" w:themeColor="accent1"/>
+          <w:top w:val="single" w:sz="8" w:space="0" w:color="1A237E" w:themeColor="accent1"/>
+          <w:left w:val="nil"/>
+          <w:bottom w:val="single" w:sz="8" w:space="0" w:color="1A237E" w:themeColor="accent1"/>
           <w:right w:val="nil"/>
           <w:insideH w:val="nil"/>
           <w:insideV w:val="nil"/>
@@ -5160,10 +5160,10 @@
       <w:tblStyleColBandSize w:val="1"/>
       <w:tblInd w:w="0" w:type="dxa"/>
       <w:tblBorders>
-        <w:top w:val="single" w:sz="8" w:space="0" w:color="4F81BD" w:themeColor="accent1"/>
-        <w:left w:val="single" w:sz="8" w:space="0" w:color="4F81BD" w:themeColor="accent1"/>
-        <w:bottom w:val="single" w:sz="8" w:space="0" w:color="4F81BD" w:themeColor="accent1"/>
-        <w:right w:val="single" w:sz="8" w:space="0" w:color="4F81BD" w:themeColor="accent1"/>
+        <w:top w:val="single" w:sz="8" w:space="0" w:color="1A237E" w:themeColor="accent1"/>
+        <w:left w:val="single" w:sz="8" w:space="0" w:color="1A237E" w:themeColor="accent1"/>
+        <w:bottom w:val="single" w:sz="8" w:space="0" w:color="1A237E" w:themeColor="accent1"/>
+        <w:right w:val="single" w:sz="8" w:space="0" w:color="1A237E" w:themeColor="accent1"/>
       </w:tblBorders>
       <w:tblCellMar>
         <w:top w:w="0" w:type="dxa"/>
@@ -5183,7 +5183,7 @@
       </w:rPr>
       <w:tblPr/>
       <w:tcPr>
-        <w:shd w:val="clear" w:color="auto" w:fill="4F81BD" w:themeFill="accent1"/>
+        <w:shd w:val="clear" w:color="auto" w:fill="1A237E" w:themeFill="accent1"/>
       </w:tcPr>
     </w:tblStylePr>
     <w:tblStylePr w:type="lastRow">
@@ -5197,10 +5197,10 @@
       <w:tblPr/>
       <w:tcPr>
         <w:tcBorders>
-          <w:top w:val="double" w:sz="6" w:space="0" w:color="4F81BD" w:themeColor="accent1"/>
-          <w:left w:val="single" w:sz="8" w:space="0" w:color="4F81BD" w:themeColor="accent1"/>
-          <w:bottom w:val="single" w:sz="8" w:space="0" w:color="4F81BD" w:themeColor="accent1"/>
-          <w:right w:val="single" w:sz="8" w:space="0" w:color="4F81BD" w:themeColor="accent1"/>
+          <w:top w:val="double" w:sz="6" w:space="0" w:color="1A237E" w:themeColor="accent1"/>
+          <w:left w:val="single" w:sz="8" w:space="0" w:color="1A237E" w:themeColor="accent1"/>
+          <w:bottom w:val="single" w:sz="8" w:space="0" w:color="1A237E" w:themeColor="accent1"/>
+          <w:right w:val="single" w:sz="8" w:space="0" w:color="1A237E" w:themeColor="accent1"/>
         </w:tcBorders>
       </w:tcPr>
     </w:tblStylePr>
@@ -5220,10 +5220,10 @@
       <w:tblPr/>
       <w:tcPr>
         <w:tcBorders>
-          <w:top w:val="single" w:sz="8" w:space="0" w:color="4F81BD" w:themeColor="accent1"/>
-          <w:left w:val="single" w:sz="8" w:space="0" w:color="4F81BD" w:themeColor="accent1"/>
-          <w:bottom w:val="single" w:sz="8" w:space="0" w:color="4F81BD" w:themeColor="accent1"/>
-          <w:right w:val="single" w:sz="8" w:space="0" w:color="4F81BD" w:themeColor="accent1"/>
+          <w:top w:val="single" w:sz="8" w:space="0" w:color="1A237E" w:themeColor="accent1"/>
+          <w:left w:val="single" w:sz="8" w:space="0" w:color="1A237E" w:themeColor="accent1"/>
+          <w:bottom w:val="single" w:sz="8" w:space="0" w:color="1A237E" w:themeColor="accent1"/>
+          <w:right w:val="single" w:sz="8" w:space="0" w:color="1A237E" w:themeColor="accent1"/>
         </w:tcBorders>
       </w:tcPr>
     </w:tblStylePr>
@@ -5231,10 +5231,10 @@
       <w:tblPr/>
       <w:tcPr>
         <w:tcBorders>
-          <w:top w:val="single" w:sz="8" w:space="0" w:color="4F81BD" w:themeColor="accent1"/>
-          <w:left w:val="single" w:sz="8" w:space="0" w:color="4F81BD" w:themeColor="accent1"/>
-          <w:bottom w:val="single" w:sz="8" w:space="0" w:color="4F81BD" w:themeColor="accent1"/>
-          <w:right w:val="single" w:sz="8" w:space="0" w:color="4F81BD" w:themeColor="accent1"/>
+          <w:top w:val="single" w:sz="8" w:space="0" w:color="1A237E" w:themeColor="accent1"/>
+          <w:left w:val="single" w:sz="8" w:space="0" w:color="1A237E" w:themeColor="accent1"/>
+          <w:bottom w:val="single" w:sz="8" w:space="0" w:color="1A237E" w:themeColor="accent1"/>
+          <w:right w:val="single" w:sz="8" w:space="0" w:color="1A237E" w:themeColor="accent1"/>
         </w:tcBorders>
       </w:tcPr>
     </w:tblStylePr>
@@ -5842,12 +5842,12 @@
       <w:tblStyleColBandSize w:val="1"/>
       <w:tblInd w:w="0" w:type="dxa"/>
       <w:tblBorders>
-        <w:top w:val="single" w:sz="8" w:space="0" w:color="4F81BD" w:themeColor="accent1"/>
-        <w:left w:val="single" w:sz="8" w:space="0" w:color="4F81BD" w:themeColor="accent1"/>
-        <w:bottom w:val="single" w:sz="8" w:space="0" w:color="4F81BD" w:themeColor="accent1"/>
-        <w:right w:val="single" w:sz="8" w:space="0" w:color="4F81BD" w:themeColor="accent1"/>
-        <w:insideH w:val="single" w:sz="8" w:space="0" w:color="4F81BD" w:themeColor="accent1"/>
-        <w:insideV w:val="single" w:sz="8" w:space="0" w:color="4F81BD" w:themeColor="accent1"/>
+        <w:top w:val="single" w:sz="8" w:space="0" w:color="1A237E" w:themeColor="accent1"/>
+        <w:left w:val="single" w:sz="8" w:space="0" w:color="1A237E" w:themeColor="accent1"/>
+        <w:bottom w:val="single" w:sz="8" w:space="0" w:color="1A237E" w:themeColor="accent1"/>
+        <w:right w:val="single" w:sz="8" w:space="0" w:color="1A237E" w:themeColor="accent1"/>
+        <w:insideH w:val="single" w:sz="8" w:space="0" w:color="1A237E" w:themeColor="accent1"/>
+        <w:insideV w:val="single" w:sz="8" w:space="0" w:color="1A237E" w:themeColor="accent1"/>
       </w:tblBorders>
       <w:tblCellMar>
         <w:top w:w="0" w:type="dxa"/>
@@ -5868,12 +5868,12 @@
       <w:tblPr/>
       <w:tcPr>
         <w:tcBorders>
-          <w:top w:val="single" w:sz="8" w:space="0" w:color="4F81BD" w:themeColor="accent1"/>
-          <w:left w:val="single" w:sz="8" w:space="0" w:color="4F81BD" w:themeColor="accent1"/>
-          <w:bottom w:val="single" w:sz="18" w:space="0" w:color="4F81BD" w:themeColor="accent1"/>
-          <w:right w:val="single" w:sz="8" w:space="0" w:color="4F81BD" w:themeColor="accent1"/>
-          <w:insideH w:val="nil"/>
-          <w:insideV w:val="single" w:sz="8" w:space="0" w:color="4F81BD" w:themeColor="accent1"/>
+          <w:top w:val="single" w:sz="8" w:space="0" w:color="1A237E" w:themeColor="accent1"/>
+          <w:left w:val="single" w:sz="8" w:space="0" w:color="1A237E" w:themeColor="accent1"/>
+          <w:bottom w:val="single" w:sz="18" w:space="0" w:color="1A237E" w:themeColor="accent1"/>
+          <w:right w:val="single" w:sz="8" w:space="0" w:color="1A237E" w:themeColor="accent1"/>
+          <w:insideH w:val="nil"/>
+          <w:insideV w:val="single" w:sz="8" w:space="0" w:color="1A237E" w:themeColor="accent1"/>
         </w:tcBorders>
       </w:tcPr>
     </w:tblStylePr>
@@ -5889,12 +5889,12 @@
       <w:tblPr/>
       <w:tcPr>
         <w:tcBorders>
-          <w:top w:val="double" w:sz="6" w:space="0" w:color="4F81BD" w:themeColor="accent1"/>
-          <w:left w:val="single" w:sz="8" w:space="0" w:color="4F81BD" w:themeColor="accent1"/>
-          <w:bottom w:val="single" w:sz="8" w:space="0" w:color="4F81BD" w:themeColor="accent1"/>
-          <w:right w:val="single" w:sz="8" w:space="0" w:color="4F81BD" w:themeColor="accent1"/>
-          <w:insideH w:val="nil"/>
-          <w:insideV w:val="single" w:sz="8" w:space="0" w:color="4F81BD" w:themeColor="accent1"/>
+          <w:top w:val="double" w:sz="6" w:space="0" w:color="1A237E" w:themeColor="accent1"/>
+          <w:left w:val="single" w:sz="8" w:space="0" w:color="1A237E" w:themeColor="accent1"/>
+          <w:bottom w:val="single" w:sz="8" w:space="0" w:color="1A237E" w:themeColor="accent1"/>
+          <w:right w:val="single" w:sz="8" w:space="0" w:color="1A237E" w:themeColor="accent1"/>
+          <w:insideH w:val="nil"/>
+          <w:insideV w:val="single" w:sz="8" w:space="0" w:color="1A237E" w:themeColor="accent1"/>
         </w:tcBorders>
       </w:tcPr>
     </w:tblStylePr>
@@ -5914,10 +5914,10 @@
       <w:tblPr/>
       <w:tcPr>
         <w:tcBorders>
-          <w:top w:val="single" w:sz="8" w:space="0" w:color="4F81BD" w:themeColor="accent1"/>
-          <w:left w:val="single" w:sz="8" w:space="0" w:color="4F81BD" w:themeColor="accent1"/>
-          <w:bottom w:val="single" w:sz="8" w:space="0" w:color="4F81BD" w:themeColor="accent1"/>
-          <w:right w:val="single" w:sz="8" w:space="0" w:color="4F81BD" w:themeColor="accent1"/>
+          <w:top w:val="single" w:sz="8" w:space="0" w:color="1A237E" w:themeColor="accent1"/>
+          <w:left w:val="single" w:sz="8" w:space="0" w:color="1A237E" w:themeColor="accent1"/>
+          <w:bottom w:val="single" w:sz="8" w:space="0" w:color="1A237E" w:themeColor="accent1"/>
+          <w:right w:val="single" w:sz="8" w:space="0" w:color="1A237E" w:themeColor="accent1"/>
         </w:tcBorders>
       </w:tcPr>
     </w:tblStylePr>
@@ -5925,10 +5925,10 @@
       <w:tblPr/>
       <w:tcPr>
         <w:tcBorders>
-          <w:top w:val="single" w:sz="8" w:space="0" w:color="4F81BD" w:themeColor="accent1"/>
-          <w:left w:val="single" w:sz="8" w:space="0" w:color="4F81BD" w:themeColor="accent1"/>
-          <w:bottom w:val="single" w:sz="8" w:space="0" w:color="4F81BD" w:themeColor="accent1"/>
-          <w:right w:val="single" w:sz="8" w:space="0" w:color="4F81BD" w:themeColor="accent1"/>
+          <w:top w:val="single" w:sz="8" w:space="0" w:color="1A237E" w:themeColor="accent1"/>
+          <w:left w:val="single" w:sz="8" w:space="0" w:color="1A237E" w:themeColor="accent1"/>
+          <w:bottom w:val="single" w:sz="8" w:space="0" w:color="1A237E" w:themeColor="accent1"/>
+          <w:right w:val="single" w:sz="8" w:space="0" w:color="1A237E" w:themeColor="accent1"/>
         </w:tcBorders>
         <w:shd w:val="clear" w:color="auto" w:fill="D3DFEE" w:themeFill="accent1" w:themeFillTint="3F"/>
       </w:tcPr>
@@ -5937,11 +5937,11 @@
       <w:tblPr/>
       <w:tcPr>
         <w:tcBorders>
-          <w:top w:val="single" w:sz="8" w:space="0" w:color="4F81BD" w:themeColor="accent1"/>
-          <w:left w:val="single" w:sz="8" w:space="0" w:color="4F81BD" w:themeColor="accent1"/>
-          <w:bottom w:val="single" w:sz="8" w:space="0" w:color="4F81BD" w:themeColor="accent1"/>
-          <w:right w:val="single" w:sz="8" w:space="0" w:color="4F81BD" w:themeColor="accent1"/>
-          <w:insideV w:val="single" w:sz="8" w:space="0" w:color="4F81BD" w:themeColor="accent1"/>
+          <w:top w:val="single" w:sz="8" w:space="0" w:color="1A237E" w:themeColor="accent1"/>
+          <w:left w:val="single" w:sz="8" w:space="0" w:color="1A237E" w:themeColor="accent1"/>
+          <w:bottom w:val="single" w:sz="8" w:space="0" w:color="1A237E" w:themeColor="accent1"/>
+          <w:right w:val="single" w:sz="8" w:space="0" w:color="1A237E" w:themeColor="accent1"/>
+          <w:insideV w:val="single" w:sz="8" w:space="0" w:color="1A237E" w:themeColor="accent1"/>
         </w:tcBorders>
         <w:shd w:val="clear" w:color="auto" w:fill="D3DFEE" w:themeFill="accent1" w:themeFillTint="3F"/>
       </w:tcPr>
@@ -5950,11 +5950,11 @@
       <w:tblPr/>
       <w:tcPr>
         <w:tcBorders>
-          <w:top w:val="single" w:sz="8" w:space="0" w:color="4F81BD" w:themeColor="accent1"/>
-          <w:left w:val="single" w:sz="8" w:space="0" w:color="4F81BD" w:themeColor="accent1"/>
-          <w:bottom w:val="single" w:sz="8" w:space="0" w:color="4F81BD" w:themeColor="accent1"/>
-          <w:right w:val="single" w:sz="8" w:space="0" w:color="4F81BD" w:themeColor="accent1"/>
-          <w:insideV w:val="single" w:sz="8" w:space="0" w:color="4F81BD" w:themeColor="accent1"/>
+          <w:top w:val="single" w:sz="8" w:space="0" w:color="1A237E" w:themeColor="accent1"/>
+          <w:left w:val="single" w:sz="8" w:space="0" w:color="1A237E" w:themeColor="accent1"/>
+          <w:bottom w:val="single" w:sz="8" w:space="0" w:color="1A237E" w:themeColor="accent1"/>
+          <w:right w:val="single" w:sz="8" w:space="0" w:color="1A237E" w:themeColor="accent1"/>
+          <w:insideV w:val="single" w:sz="8" w:space="0" w:color="1A237E" w:themeColor="accent1"/>
         </w:tcBorders>
       </w:tcPr>
     </w:tblStylePr>
@@ -6760,7 +6760,7 @@
           <w:insideH w:val="nil"/>
           <w:insideV w:val="nil"/>
         </w:tcBorders>
-        <w:shd w:val="clear" w:color="auto" w:fill="4F81BD" w:themeFill="accent1"/>
+        <w:shd w:val="clear" w:color="auto" w:fill="1A237E" w:themeFill="accent1"/>
       </w:tcPr>
     </w:tblStylePr>
     <w:tblStylePr w:type="lastRow">
@@ -7542,7 +7542,7 @@
           <w:insideH w:val="nil"/>
           <w:insideV w:val="nil"/>
         </w:tcBorders>
-        <w:shd w:val="clear" w:color="auto" w:fill="4F81BD" w:themeFill="accent1"/>
+        <w:shd w:val="clear" w:color="auto" w:fill="1A237E" w:themeFill="accent1"/>
       </w:tcPr>
     </w:tblStylePr>
     <w:tblStylePr w:type="lastRow">
@@ -7581,7 +7581,7 @@
           <w:insideH w:val="nil"/>
           <w:insideV w:val="nil"/>
         </w:tcBorders>
-        <w:shd w:val="clear" w:color="auto" w:fill="4F81BD" w:themeFill="accent1"/>
+        <w:shd w:val="clear" w:color="auto" w:fill="1A237E" w:themeFill="accent1"/>
       </w:tcPr>
     </w:tblStylePr>
     <w:tblStylePr w:type="lastCol">
@@ -7598,7 +7598,7 @@
           <w:insideH w:val="nil"/>
           <w:insideV w:val="nil"/>
         </w:tcBorders>
-        <w:shd w:val="clear" w:color="auto" w:fill="4F81BD" w:themeFill="accent1"/>
+        <w:shd w:val="clear" w:color="auto" w:fill="1A237E" w:themeFill="accent1"/>
       </w:tcPr>
     </w:tblStylePr>
     <w:tblStylePr w:type="band1Vert">
@@ -8403,7 +8403,7 @@
       <w:spacing w:after="0" w:line="240" w:lineRule="auto"/>
     </w:pPr>
     <w:rPr>
-      <w:color w:val="000000" w:themeColor="text1"/>
+      <w:color w:val="2D2D2D" w:themeColor="text1"/>
     </w:rPr>
     <w:tblPr>
       <w:tblStyleRowBandSize w:val="1"/>
@@ -8487,15 +8487,15 @@
       <w:spacing w:after="0" w:line="240" w:lineRule="auto"/>
     </w:pPr>
     <w:rPr>
-      <w:color w:val="000000" w:themeColor="text1"/>
+      <w:color w:val="2D2D2D" w:themeColor="text1"/>
     </w:rPr>
     <w:tblPr>
       <w:tblStyleRowBandSize w:val="1"/>
       <w:tblStyleColBandSize w:val="1"/>
       <w:tblInd w:w="0" w:type="dxa"/>
       <w:tblBorders>
-        <w:top w:val="single" w:sz="8" w:space="0" w:color="4F81BD" w:themeColor="accent1"/>
-        <w:bottom w:val="single" w:sz="8" w:space="0" w:color="4F81BD" w:themeColor="accent1"/>
+        <w:top w:val="single" w:sz="8" w:space="0" w:color="1A237E" w:themeColor="accent1"/>
+        <w:bottom w:val="single" w:sz="8" w:space="0" w:color="1A237E" w:themeColor="accent1"/>
       </w:tblBorders>
       <w:tblCellMar>
         <w:top w:w="0" w:type="dxa"/>
@@ -8512,7 +8512,7 @@
       <w:tcPr>
         <w:tcBorders>
           <w:top w:val="nil"/>
-          <w:bottom w:val="single" w:sz="8" w:space="0" w:color="4F81BD" w:themeColor="accent1"/>
+          <w:bottom w:val="single" w:sz="8" w:space="0" w:color="1A237E" w:themeColor="accent1"/>
         </w:tcBorders>
       </w:tcPr>
     </w:tblStylePr>
@@ -8525,8 +8525,8 @@
       <w:tblPr/>
       <w:tcPr>
         <w:tcBorders>
-          <w:top w:val="single" w:sz="8" w:space="0" w:color="4F81BD" w:themeColor="accent1"/>
-          <w:bottom w:val="single" w:sz="8" w:space="0" w:color="4F81BD" w:themeColor="accent1"/>
+          <w:top w:val="single" w:sz="8" w:space="0" w:color="1A237E" w:themeColor="accent1"/>
+          <w:bottom w:val="single" w:sz="8" w:space="0" w:color="1A237E" w:themeColor="accent1"/>
         </w:tcBorders>
       </w:tcPr>
     </w:tblStylePr>
@@ -8544,8 +8544,8 @@
       <w:tblPr/>
       <w:tcPr>
         <w:tcBorders>
-          <w:top w:val="single" w:sz="8" w:space="0" w:color="4F81BD" w:themeColor="accent1"/>
-          <w:bottom w:val="single" w:sz="8" w:space="0" w:color="4F81BD" w:themeColor="accent1"/>
+          <w:top w:val="single" w:sz="8" w:space="0" w:color="1A237E" w:themeColor="accent1"/>
+          <w:bottom w:val="single" w:sz="8" w:space="0" w:color="1A237E" w:themeColor="accent1"/>
         </w:tcBorders>
       </w:tcPr>
     </w:tblStylePr>
@@ -8571,7 +8571,7 @@
       <w:spacing w:after="0" w:line="240" w:lineRule="auto"/>
     </w:pPr>
     <w:rPr>
-      <w:color w:val="000000" w:themeColor="text1"/>
+      <w:color w:val="2D2D2D" w:themeColor="text1"/>
     </w:rPr>
     <w:tblPr>
       <w:tblStyleRowBandSize w:val="1"/>
@@ -8655,7 +8655,7 @@
       <w:spacing w:after="0" w:line="240" w:lineRule="auto"/>
     </w:pPr>
     <w:rPr>
-      <w:color w:val="000000" w:themeColor="text1"/>
+      <w:color w:val="2D2D2D" w:themeColor="text1"/>
     </w:rPr>
     <w:tblPr>
       <w:tblStyleRowBandSize w:val="1"/>
@@ -8739,7 +8739,7 @@
       <w:spacing w:after="0" w:line="240" w:lineRule="auto"/>
     </w:pPr>
     <w:rPr>
-      <w:color w:val="000000" w:themeColor="text1"/>
+      <w:color w:val="2D2D2D" w:themeColor="text1"/>
     </w:rPr>
     <w:tblPr>
       <w:tblStyleRowBandSize w:val="1"/>
@@ -8823,7 +8823,7 @@
       <w:spacing w:after="0" w:line="240" w:lineRule="auto"/>
     </w:pPr>
     <w:rPr>
-      <w:color w:val="000000" w:themeColor="text1"/>
+      <w:color w:val="2D2D2D" w:themeColor="text1"/>
     </w:rPr>
     <w:tblPr>
       <w:tblStyleRowBandSize w:val="1"/>
@@ -8907,7 +8907,7 @@
       <w:spacing w:after="0" w:line="240" w:lineRule="auto"/>
     </w:pPr>
     <w:rPr>
-      <w:color w:val="000000" w:themeColor="text1"/>
+      <w:color w:val="2D2D2D" w:themeColor="text1"/>
     </w:rPr>
     <w:tblPr>
       <w:tblStyleRowBandSize w:val="1"/>
@@ -8992,7 +8992,7 @@
     </w:pPr>
     <w:rPr>
       <w:rFonts w:asciiTheme="majorHAnsi" w:eastAsiaTheme="majorEastAsia" w:hAnsiTheme="majorHAnsi" w:cstheme="majorBidi"/>
-      <w:color w:val="000000" w:themeColor="text1"/>
+      <w:color w:val="2D2D2D" w:themeColor="text1"/>
     </w:rPr>
     <w:tblPr>
       <w:tblStyleRowBandSize w:val="1"/>
@@ -9120,17 +9120,17 @@
     </w:pPr>
     <w:rPr>
       <w:rFonts w:asciiTheme="majorHAnsi" w:eastAsiaTheme="majorEastAsia" w:hAnsiTheme="majorHAnsi" w:cstheme="majorBidi"/>
-      <w:color w:val="000000" w:themeColor="text1"/>
+      <w:color w:val="2D2D2D" w:themeColor="text1"/>
     </w:rPr>
     <w:tblPr>
       <w:tblStyleRowBandSize w:val="1"/>
       <w:tblStyleColBandSize w:val="1"/>
       <w:tblInd w:w="0" w:type="dxa"/>
       <w:tblBorders>
-        <w:top w:val="single" w:sz="8" w:space="0" w:color="4F81BD" w:themeColor="accent1"/>
-        <w:left w:val="single" w:sz="8" w:space="0" w:color="4F81BD" w:themeColor="accent1"/>
-        <w:bottom w:val="single" w:sz="8" w:space="0" w:color="4F81BD" w:themeColor="accent1"/>
-        <w:right w:val="single" w:sz="8" w:space="0" w:color="4F81BD" w:themeColor="accent1"/>
+        <w:top w:val="single" w:sz="8" w:space="0" w:color="1A237E" w:themeColor="accent1"/>
+        <w:left w:val="single" w:sz="8" w:space="0" w:color="1A237E" w:themeColor="accent1"/>
+        <w:bottom w:val="single" w:sz="8" w:space="0" w:color="1A237E" w:themeColor="accent1"/>
+        <w:right w:val="single" w:sz="8" w:space="0" w:color="1A237E" w:themeColor="accent1"/>
       </w:tblBorders>
       <w:tblCellMar>
         <w:top w:w="0" w:type="dxa"/>
@@ -9149,7 +9149,7 @@
         <w:tcBorders>
           <w:top w:val="nil"/>
           <w:left w:val="nil"/>
-          <w:bottom w:val="single" w:sz="24" w:space="0" w:color="4F81BD" w:themeColor="accent1"/>
+          <w:bottom w:val="single" w:sz="24" w:space="0" w:color="1A237E" w:themeColor="accent1"/>
           <w:right w:val="nil"/>
           <w:insideH w:val="nil"/>
           <w:insideV w:val="nil"/>
@@ -9161,7 +9161,7 @@
       <w:tblPr/>
       <w:tcPr>
         <w:tcBorders>
-          <w:top w:val="single" w:sz="8" w:space="0" w:color="4F81BD" w:themeColor="accent1"/>
+          <w:top w:val="single" w:sz="8" w:space="0" w:color="1A237E" w:themeColor="accent1"/>
           <w:left w:val="nil"/>
           <w:bottom w:val="nil"/>
           <w:right w:val="nil"/>
@@ -9178,7 +9178,7 @@
           <w:top w:val="nil"/>
           <w:left w:val="nil"/>
           <w:bottom w:val="nil"/>
-          <w:right w:val="single" w:sz="8" w:space="0" w:color="4F81BD" w:themeColor="accent1"/>
+          <w:right w:val="single" w:sz="8" w:space="0" w:color="1A237E" w:themeColor="accent1"/>
           <w:insideH w:val="nil"/>
           <w:insideV w:val="nil"/>
         </w:tcBorders>
@@ -9190,7 +9190,7 @@
       <w:tcPr>
         <w:tcBorders>
           <w:top w:val="nil"/>
-          <w:left w:val="single" w:sz="8" w:space="0" w:color="4F81BD" w:themeColor="accent1"/>
+          <w:left w:val="single" w:sz="8" w:space="0" w:color="1A237E" w:themeColor="accent1"/>
           <w:bottom w:val="nil"/>
           <w:right w:val="nil"/>
           <w:insideH w:val="nil"/>
@@ -9248,7 +9248,7 @@
     </w:pPr>
     <w:rPr>
       <w:rFonts w:asciiTheme="majorHAnsi" w:eastAsiaTheme="majorEastAsia" w:hAnsiTheme="majorHAnsi" w:cstheme="majorBidi"/>
-      <w:color w:val="000000" w:themeColor="text1"/>
+      <w:color w:val="2D2D2D" w:themeColor="text1"/>
     </w:rPr>
     <w:tblPr>
       <w:tblStyleRowBandSize w:val="1"/>
@@ -9376,7 +9376,7 @@
     </w:pPr>
     <w:rPr>
       <w:rFonts w:asciiTheme="majorHAnsi" w:eastAsiaTheme="majorEastAsia" w:hAnsiTheme="majorHAnsi" w:cstheme="majorBidi"/>
-      <w:color w:val="000000" w:themeColor="text1"/>
+      <w:color w:val="2D2D2D" w:themeColor="text1"/>
     </w:rPr>
     <w:tblPr>
       <w:tblStyleRowBandSize w:val="1"/>
@@ -9504,7 +9504,7 @@
     </w:pPr>
     <w:rPr>
       <w:rFonts w:asciiTheme="majorHAnsi" w:eastAsiaTheme="majorEastAsia" w:hAnsiTheme="majorHAnsi" w:cstheme="majorBidi"/>
-      <w:color w:val="000000" w:themeColor="text1"/>
+      <w:color w:val="2D2D2D" w:themeColor="text1"/>
     </w:rPr>
     <w:tblPr>
       <w:tblStyleRowBandSize w:val="1"/>
@@ -9632,7 +9632,7 @@
     </w:pPr>
     <w:rPr>
       <w:rFonts w:asciiTheme="majorHAnsi" w:eastAsiaTheme="majorEastAsia" w:hAnsiTheme="majorHAnsi" w:cstheme="majorBidi"/>
-      <w:color w:val="000000" w:themeColor="text1"/>
+      <w:color w:val="2D2D2D" w:themeColor="text1"/>
     </w:rPr>
     <w:tblPr>
       <w:tblStyleRowBandSize w:val="1"/>
@@ -9760,7 +9760,7 @@
     </w:pPr>
     <w:rPr>
       <w:rFonts w:asciiTheme="majorHAnsi" w:eastAsiaTheme="majorEastAsia" w:hAnsiTheme="majorHAnsi" w:cstheme="majorBidi"/>
-      <w:color w:val="000000" w:themeColor="text1"/>
+      <w:color w:val="2D2D2D" w:themeColor="text1"/>
     </w:rPr>
     <w:tblPr>
       <w:tblStyleRowBandSize w:val="1"/>
@@ -10399,7 +10399,7 @@
     </w:pPr>
     <w:rPr>
       <w:rFonts w:asciiTheme="majorHAnsi" w:eastAsiaTheme="majorEastAsia" w:hAnsiTheme="majorHAnsi" w:cstheme="majorBidi"/>
-      <w:color w:val="000000" w:themeColor="text1"/>
+      <w:color w:val="2D2D2D" w:themeColor="text1"/>
     </w:rPr>
     <w:tblPr>
       <w:tblStyleRowBandSize w:val="1"/>
@@ -10427,7 +10427,7 @@
       <w:rPr>
         <w:b/>
         <w:bCs/>
-        <w:color w:val="000000" w:themeColor="text1"/>
+        <w:color w:val="2D2D2D" w:themeColor="text1"/>
       </w:rPr>
       <w:tblPr/>
       <w:tcPr>
@@ -10438,7 +10438,7 @@
       <w:rPr>
         <w:b/>
         <w:bCs/>
-        <w:color w:val="000000" w:themeColor="text1"/>
+        <w:color w:val="2D2D2D" w:themeColor="text1"/>
       </w:rPr>
       <w:tblPr/>
       <w:tcPr>
@@ -10457,7 +10457,7 @@
       <w:rPr>
         <w:b/>
         <w:bCs/>
-        <w:color w:val="000000" w:themeColor="text1"/>
+        <w:color w:val="2D2D2D" w:themeColor="text1"/>
       </w:rPr>
       <w:tblPr/>
       <w:tcPr>
@@ -10476,7 +10476,7 @@
       <w:rPr>
         <w:b w:val="0"/>
         <w:bCs w:val="0"/>
-        <w:color w:val="000000" w:themeColor="text1"/>
+        <w:color w:val="2D2D2D" w:themeColor="text1"/>
       </w:rPr>
       <w:tblPr/>
       <w:tcPr>
@@ -10524,19 +10524,19 @@
     </w:pPr>
     <w:rPr>
       <w:rFonts w:asciiTheme="majorHAnsi" w:eastAsiaTheme="majorEastAsia" w:hAnsiTheme="majorHAnsi" w:cstheme="majorBidi"/>
-      <w:color w:val="000000" w:themeColor="text1"/>
+      <w:color w:val="2D2D2D" w:themeColor="text1"/>
     </w:rPr>
     <w:tblPr>
       <w:tblStyleRowBandSize w:val="1"/>
       <w:tblStyleColBandSize w:val="1"/>
       <w:tblInd w:w="0" w:type="dxa"/>
       <w:tblBorders>
-        <w:top w:val="single" w:sz="8" w:space="0" w:color="4F81BD" w:themeColor="accent1"/>
-        <w:left w:val="single" w:sz="8" w:space="0" w:color="4F81BD" w:themeColor="accent1"/>
-        <w:bottom w:val="single" w:sz="8" w:space="0" w:color="4F81BD" w:themeColor="accent1"/>
-        <w:right w:val="single" w:sz="8" w:space="0" w:color="4F81BD" w:themeColor="accent1"/>
-        <w:insideH w:val="single" w:sz="8" w:space="0" w:color="4F81BD" w:themeColor="accent1"/>
-        <w:insideV w:val="single" w:sz="8" w:space="0" w:color="4F81BD" w:themeColor="accent1"/>
+        <w:top w:val="single" w:sz="8" w:space="0" w:color="1A237E" w:themeColor="accent1"/>
+        <w:left w:val="single" w:sz="8" w:space="0" w:color="1A237E" w:themeColor="accent1"/>
+        <w:bottom w:val="single" w:sz="8" w:space="0" w:color="1A237E" w:themeColor="accent1"/>
+        <w:right w:val="single" w:sz="8" w:space="0" w:color="1A237E" w:themeColor="accent1"/>
+        <w:insideH w:val="single" w:sz="8" w:space="0" w:color="1A237E" w:themeColor="accent1"/>
+        <w:insideV w:val="single" w:sz="8" w:space="0" w:color="1A237E" w:themeColor="accent1"/>
       </w:tblBorders>
       <w:tblCellMar>
         <w:top w:w="0" w:type="dxa"/>
@@ -10552,7 +10552,7 @@
       <w:rPr>
         <w:b/>
         <w:bCs/>
-        <w:color w:val="000000" w:themeColor="text1"/>
+        <w:color w:val="2D2D2D" w:themeColor="text1"/>
       </w:rPr>
       <w:tblPr/>
       <w:tcPr>
@@ -10563,7 +10563,7 @@
       <w:rPr>
         <w:b/>
         <w:bCs/>
-        <w:color w:val="000000" w:themeColor="text1"/>
+        <w:color w:val="2D2D2D" w:themeColor="text1"/>
       </w:rPr>
       <w:tblPr/>
       <w:tcPr>
@@ -10582,7 +10582,7 @@
       <w:rPr>
         <w:b/>
         <w:bCs/>
-        <w:color w:val="000000" w:themeColor="text1"/>
+        <w:color w:val="2D2D2D" w:themeColor="text1"/>
       </w:rPr>
       <w:tblPr/>
       <w:tcPr>
@@ -10601,7 +10601,7 @@
       <w:rPr>
         <w:b w:val="0"/>
         <w:bCs w:val="0"/>
-        <w:color w:val="000000" w:themeColor="text1"/>
+        <w:color w:val="2D2D2D" w:themeColor="text1"/>
       </w:rPr>
       <w:tblPr/>
       <w:tcPr>
@@ -10626,8 +10626,8 @@
       <w:tblPr/>
       <w:tcPr>
         <w:tcBorders>
-          <w:insideH w:val="single" w:sz="6" w:space="0" w:color="4F81BD" w:themeColor="accent1"/>
-          <w:insideV w:val="single" w:sz="6" w:space="0" w:color="4F81BD" w:themeColor="accent1"/>
+          <w:insideH w:val="single" w:sz="6" w:space="0" w:color="1A237E" w:themeColor="accent1"/>
+          <w:insideV w:val="single" w:sz="6" w:space="0" w:color="1A237E" w:themeColor="accent1"/>
         </w:tcBorders>
         <w:shd w:val="clear" w:color="auto" w:fill="A7BFDE" w:themeFill="accent1" w:themeFillTint="7F"/>
       </w:tcPr>
@@ -10649,7 +10649,7 @@
     </w:pPr>
     <w:rPr>
       <w:rFonts w:asciiTheme="majorHAnsi" w:eastAsiaTheme="majorEastAsia" w:hAnsiTheme="majorHAnsi" w:cstheme="majorBidi"/>
-      <w:color w:val="000000" w:themeColor="text1"/>
+      <w:color w:val="2D2D2D" w:themeColor="text1"/>
     </w:rPr>
     <w:tblPr>
       <w:tblStyleRowBandSize w:val="1"/>
@@ -10677,7 +10677,7 @@
       <w:rPr>
         <w:b/>
         <w:bCs/>
-        <w:color w:val="000000" w:themeColor="text1"/>
+        <w:color w:val="2D2D2D" w:themeColor="text1"/>
       </w:rPr>
       <w:tblPr/>
       <w:tcPr>
@@ -10688,7 +10688,7 @@
       <w:rPr>
         <w:b/>
         <w:bCs/>
-        <w:color w:val="000000" w:themeColor="text1"/>
+        <w:color w:val="2D2D2D" w:themeColor="text1"/>
       </w:rPr>
       <w:tblPr/>
       <w:tcPr>
@@ -10707,7 +10707,7 @@
       <w:rPr>
         <w:b/>
         <w:bCs/>
-        <w:color w:val="000000" w:themeColor="text1"/>
+        <w:color w:val="2D2D2D" w:themeColor="text1"/>
       </w:rPr>
       <w:tblPr/>
       <w:tcPr>
@@ -10726,7 +10726,7 @@
       <w:rPr>
         <w:b w:val="0"/>
         <w:bCs w:val="0"/>
-        <w:color w:val="000000" w:themeColor="text1"/>
+        <w:color w:val="2D2D2D" w:themeColor="text1"/>
       </w:rPr>
       <w:tblPr/>
       <w:tcPr>
@@ -10774,7 +10774,7 @@
     </w:pPr>
     <w:rPr>
       <w:rFonts w:asciiTheme="majorHAnsi" w:eastAsiaTheme="majorEastAsia" w:hAnsiTheme="majorHAnsi" w:cstheme="majorBidi"/>
-      <w:color w:val="000000" w:themeColor="text1"/>
+      <w:color w:val="2D2D2D" w:themeColor="text1"/>
     </w:rPr>
     <w:tblPr>
       <w:tblStyleRowBandSize w:val="1"/>
@@ -10802,7 +10802,7 @@
       <w:rPr>
         <w:b/>
         <w:bCs/>
-        <w:color w:val="000000" w:themeColor="text1"/>
+        <w:color w:val="2D2D2D" w:themeColor="text1"/>
       </w:rPr>
       <w:tblPr/>
       <w:tcPr>
@@ -10813,7 +10813,7 @@
       <w:rPr>
         <w:b/>
         <w:bCs/>
-        <w:color w:val="000000" w:themeColor="text1"/>
+        <w:color w:val="2D2D2D" w:themeColor="text1"/>
       </w:rPr>
       <w:tblPr/>
       <w:tcPr>
@@ -10832,7 +10832,7 @@
       <w:rPr>
         <w:b/>
         <w:bCs/>
-        <w:color w:val="000000" w:themeColor="text1"/>
+        <w:color w:val="2D2D2D" w:themeColor="text1"/>
       </w:rPr>
       <w:tblPr/>
       <w:tcPr>
@@ -10851,7 +10851,7 @@
       <w:rPr>
         <w:b w:val="0"/>
         <w:bCs w:val="0"/>
-        <w:color w:val="000000" w:themeColor="text1"/>
+        <w:color w:val="2D2D2D" w:themeColor="text1"/>
       </w:rPr>
       <w:tblPr/>
       <w:tcPr>
@@ -10899,7 +10899,7 @@
     </w:pPr>
     <w:rPr>
       <w:rFonts w:asciiTheme="majorHAnsi" w:eastAsiaTheme="majorEastAsia" w:hAnsiTheme="majorHAnsi" w:cstheme="majorBidi"/>
-      <w:color w:val="000000" w:themeColor="text1"/>
+      <w:color w:val="2D2D2D" w:themeColor="text1"/>
     </w:rPr>
     <w:tblPr>
       <w:tblStyleRowBandSize w:val="1"/>
@@ -10927,7 +10927,7 @@
       <w:rPr>
         <w:b/>
         <w:bCs/>
-        <w:color w:val="000000" w:themeColor="text1"/>
+        <w:color w:val="2D2D2D" w:themeColor="text1"/>
       </w:rPr>
       <w:tblPr/>
       <w:tcPr>
@@ -10938,7 +10938,7 @@
       <w:rPr>
         <w:b/>
         <w:bCs/>
-        <w:color w:val="000000" w:themeColor="text1"/>
+        <w:color w:val="2D2D2D" w:themeColor="text1"/>
       </w:rPr>
       <w:tblPr/>
       <w:tcPr>
@@ -10957,7 +10957,7 @@
       <w:rPr>
         <w:b/>
         <w:bCs/>
-        <w:color w:val="000000" w:themeColor="text1"/>
+        <w:color w:val="2D2D2D" w:themeColor="text1"/>
       </w:rPr>
       <w:tblPr/>
       <w:tcPr>
@@ -10976,7 +10976,7 @@
       <w:rPr>
         <w:b w:val="0"/>
         <w:bCs w:val="0"/>
-        <w:color w:val="000000" w:themeColor="text1"/>
+        <w:color w:val="2D2D2D" w:themeColor="text1"/>
       </w:rPr>
       <w:tblPr/>
       <w:tcPr>
@@ -11024,7 +11024,7 @@
     </w:pPr>
     <w:rPr>
       <w:rFonts w:asciiTheme="majorHAnsi" w:eastAsiaTheme="majorEastAsia" w:hAnsiTheme="majorHAnsi" w:cstheme="majorBidi"/>
-      <w:color w:val="000000" w:themeColor="text1"/>
+      <w:color w:val="2D2D2D" w:themeColor="text1"/>
     </w:rPr>
     <w:tblPr>
       <w:tblStyleRowBandSize w:val="1"/>
@@ -11052,7 +11052,7 @@
       <w:rPr>
         <w:b/>
         <w:bCs/>
-        <w:color w:val="000000" w:themeColor="text1"/>
+        <w:color w:val="2D2D2D" w:themeColor="text1"/>
       </w:rPr>
       <w:tblPr/>
       <w:tcPr>
@@ -11063,7 +11063,7 @@
       <w:rPr>
         <w:b/>
         <w:bCs/>
-        <w:color w:val="000000" w:themeColor="text1"/>
+        <w:color w:val="2D2D2D" w:themeColor="text1"/>
       </w:rPr>
       <w:tblPr/>
       <w:tcPr>
@@ -11082,7 +11082,7 @@
       <w:rPr>
         <w:b/>
         <w:bCs/>
-        <w:color w:val="000000" w:themeColor="text1"/>
+        <w:color w:val="2D2D2D" w:themeColor="text1"/>
       </w:rPr>
       <w:tblPr/>
       <w:tcPr>
@@ -11101,7 +11101,7 @@
       <w:rPr>
         <w:b w:val="0"/>
         <w:bCs w:val="0"/>
-        <w:color w:val="000000" w:themeColor="text1"/>
+        <w:color w:val="2D2D2D" w:themeColor="text1"/>
       </w:rPr>
       <w:tblPr/>
       <w:tcPr>
@@ -11149,7 +11149,7 @@
     </w:pPr>
     <w:rPr>
       <w:rFonts w:asciiTheme="majorHAnsi" w:eastAsiaTheme="majorEastAsia" w:hAnsiTheme="majorHAnsi" w:cstheme="majorBidi"/>
-      <w:color w:val="000000" w:themeColor="text1"/>
+      <w:color w:val="2D2D2D" w:themeColor="text1"/>
     </w:rPr>
     <w:tblPr>
       <w:tblStyleRowBandSize w:val="1"/>
@@ -11177,7 +11177,7 @@
       <w:rPr>
         <w:b/>
         <w:bCs/>
-        <w:color w:val="000000" w:themeColor="text1"/>
+        <w:color w:val="2D2D2D" w:themeColor="text1"/>
       </w:rPr>
       <w:tblPr/>
       <w:tcPr>
@@ -11188,7 +11188,7 @@
       <w:rPr>
         <w:b/>
         <w:bCs/>
-        <w:color w:val="000000" w:themeColor="text1"/>
+        <w:color w:val="2D2D2D" w:themeColor="text1"/>
       </w:rPr>
       <w:tblPr/>
       <w:tcPr>
@@ -11207,7 +11207,7 @@
       <w:rPr>
         <w:b/>
         <w:bCs/>
-        <w:color w:val="000000" w:themeColor="text1"/>
+        <w:color w:val="2D2D2D" w:themeColor="text1"/>
       </w:rPr>
       <w:tblPr/>
       <w:tcPr>
@@ -11226,7 +11226,7 @@
       <w:rPr>
         <w:b w:val="0"/>
         <w:bCs w:val="0"/>
-        <w:color w:val="000000" w:themeColor="text1"/>
+        <w:color w:val="2D2D2D" w:themeColor="text1"/>
       </w:rPr>
       <w:tblPr/>
       <w:tcPr>
@@ -11453,7 +11453,7 @@
           <w:insideH w:val="nil"/>
           <w:insideV w:val="single" w:sz="8" w:space="0" w:color="FFFFFF" w:themeColor="background1"/>
         </w:tcBorders>
-        <w:shd w:val="clear" w:color="auto" w:fill="4F81BD" w:themeFill="accent1"/>
+        <w:shd w:val="clear" w:color="auto" w:fill="1A237E" w:themeFill="accent1"/>
       </w:tcPr>
     </w:tblStylePr>
     <w:tblStylePr w:type="lastRow">
@@ -11474,7 +11474,7 @@
           <w:insideH w:val="nil"/>
           <w:insideV w:val="single" w:sz="8" w:space="0" w:color="FFFFFF" w:themeColor="background1"/>
         </w:tcBorders>
-        <w:shd w:val="clear" w:color="auto" w:fill="4F81BD" w:themeFill="accent1"/>
+        <w:shd w:val="clear" w:color="auto" w:fill="1A237E" w:themeFill="accent1"/>
       </w:tcPr>
     </w:tblStylePr>
     <w:tblStylePr w:type="firstCol">
@@ -11493,7 +11493,7 @@
           <w:insideH w:val="nil"/>
           <w:insideV w:val="nil"/>
         </w:tcBorders>
-        <w:shd w:val="clear" w:color="auto" w:fill="4F81BD" w:themeFill="accent1"/>
+        <w:shd w:val="clear" w:color="auto" w:fill="1A237E" w:themeFill="accent1"/>
       </w:tcPr>
     </w:tblStylePr>
     <w:tblStylePr w:type="lastCol">
@@ -11514,7 +11514,7 @@
           <w:insideH w:val="nil"/>
           <w:insideV w:val="nil"/>
         </w:tcBorders>
-        <w:shd w:val="clear" w:color="auto" w:fill="4F81BD" w:themeFill="accent1"/>
+        <w:shd w:val="clear" w:color="auto" w:fill="1A237E" w:themeFill="accent1"/>
       </w:tcPr>
     </w:tblStylePr>
     <w:tblStylePr w:type="band1Vert">
@@ -12388,7 +12388,7 @@
       </w:tblCellMar>
     </w:tblPr>
     <w:tcPr>
-      <w:shd w:val="clear" w:color="auto" w:fill="4F81BD" w:themeFill="accent1"/>
+      <w:shd w:val="clear" w:color="auto" w:fill="1A237E" w:themeFill="accent1"/>
     </w:tcPr>
     <w:tblStylePr w:type="firstRow">
       <w:rPr>
@@ -13058,7 +13058,7 @@
       <w:spacing w:after="0" w:line="240" w:lineRule="auto"/>
     </w:pPr>
     <w:rPr>
-      <w:color w:val="000000" w:themeColor="text1"/>
+      <w:color w:val="2D2D2D" w:themeColor="text1"/>
     </w:rPr>
     <w:tblPr>
       <w:tblStyleRowBandSize w:val="1"/>
@@ -13162,12 +13162,12 @@
     </w:tblStylePr>
     <w:tblStylePr w:type="neCell">
       <w:rPr>
-        <w:color w:val="000000" w:themeColor="text1"/>
+        <w:color w:val="2D2D2D" w:themeColor="text1"/>
       </w:rPr>
     </w:tblStylePr>
     <w:tblStylePr w:type="nwCell">
       <w:rPr>
-        <w:color w:val="000000" w:themeColor="text1"/>
+        <w:color w:val="2D2D2D" w:themeColor="text1"/>
       </w:rPr>
     </w:tblStylePr>
   </w:style>
@@ -13180,7 +13180,7 @@
       <w:spacing w:after="0" w:line="240" w:lineRule="auto"/>
     </w:pPr>
     <w:rPr>
-      <w:color w:val="000000" w:themeColor="text1"/>
+      <w:color w:val="2D2D2D" w:themeColor="text1"/>
     </w:rPr>
     <w:tblPr>
       <w:tblStyleRowBandSize w:val="1"/>
@@ -13188,9 +13188,9 @@
       <w:tblInd w:w="0" w:type="dxa"/>
       <w:tblBorders>
         <w:top w:val="single" w:sz="24" w:space="0" w:color="C0504D" w:themeColor="accent2"/>
-        <w:left w:val="single" w:sz="4" w:space="0" w:color="4F81BD" w:themeColor="accent1"/>
-        <w:bottom w:val="single" w:sz="4" w:space="0" w:color="4F81BD" w:themeColor="accent1"/>
-        <w:right w:val="single" w:sz="4" w:space="0" w:color="4F81BD" w:themeColor="accent1"/>
+        <w:left w:val="single" w:sz="4" w:space="0" w:color="1A237E" w:themeColor="accent1"/>
+        <w:bottom w:val="single" w:sz="4" w:space="0" w:color="1A237E" w:themeColor="accent1"/>
+        <w:right w:val="single" w:sz="4" w:space="0" w:color="1A237E" w:themeColor="accent1"/>
         <w:insideH w:val="single" w:sz="4" w:space="0" w:color="FFFFFF" w:themeColor="background1"/>
         <w:insideV w:val="single" w:sz="4" w:space="0" w:color="FFFFFF" w:themeColor="background1"/>
       </w:tblBorders>
@@ -13284,12 +13284,12 @@
     </w:tblStylePr>
     <w:tblStylePr w:type="neCell">
       <w:rPr>
-        <w:color w:val="000000" w:themeColor="text1"/>
+        <w:color w:val="2D2D2D" w:themeColor="text1"/>
       </w:rPr>
     </w:tblStylePr>
     <w:tblStylePr w:type="nwCell">
       <w:rPr>
-        <w:color w:val="000000" w:themeColor="text1"/>
+        <w:color w:val="2D2D2D" w:themeColor="text1"/>
       </w:rPr>
     </w:tblStylePr>
   </w:style>
@@ -13302,7 +13302,7 @@
       <w:spacing w:after="0" w:line="240" w:lineRule="auto"/>
     </w:pPr>
     <w:rPr>
-      <w:color w:val="000000" w:themeColor="text1"/>
+      <w:color w:val="2D2D2D" w:themeColor="text1"/>
     </w:rPr>
     <w:tblPr>
       <w:tblStyleRowBandSize w:val="1"/>
@@ -13406,12 +13406,12 @@
     </w:tblStylePr>
     <w:tblStylePr w:type="neCell">
       <w:rPr>
-        <w:color w:val="000000" w:themeColor="text1"/>
+        <w:color w:val="2D2D2D" w:themeColor="text1"/>
       </w:rPr>
     </w:tblStylePr>
     <w:tblStylePr w:type="nwCell">
       <w:rPr>
-        <w:color w:val="000000" w:themeColor="text1"/>
+        <w:color w:val="2D2D2D" w:themeColor="text1"/>
       </w:rPr>
     </w:tblStylePr>
   </w:style>
@@ -13424,7 +13424,7 @@
       <w:spacing w:after="0" w:line="240" w:lineRule="auto"/>
     </w:pPr>
     <w:rPr>
-      <w:color w:val="000000" w:themeColor="text1"/>
+      <w:color w:val="2D2D2D" w:themeColor="text1"/>
     </w:rPr>
     <w:tblPr>
       <w:tblStyleRowBandSize w:val="1"/>
@@ -13536,7 +13536,7 @@
       <w:spacing w:after="0" w:line="240" w:lineRule="auto"/>
     </w:pPr>
     <w:rPr>
-      <w:color w:val="000000" w:themeColor="text1"/>
+      <w:color w:val="2D2D2D" w:themeColor="text1"/>
     </w:rPr>
     <w:tblPr>
       <w:tblStyleRowBandSize w:val="1"/>
@@ -13640,12 +13640,12 @@
     </w:tblStylePr>
     <w:tblStylePr w:type="neCell">
       <w:rPr>
-        <w:color w:val="000000" w:themeColor="text1"/>
+        <w:color w:val="2D2D2D" w:themeColor="text1"/>
       </w:rPr>
     </w:tblStylePr>
     <w:tblStylePr w:type="nwCell">
       <w:rPr>
-        <w:color w:val="000000" w:themeColor="text1"/>
+        <w:color w:val="2D2D2D" w:themeColor="text1"/>
       </w:rPr>
     </w:tblStylePr>
   </w:style>
@@ -13658,7 +13658,7 @@
       <w:spacing w:after="0" w:line="240" w:lineRule="auto"/>
     </w:pPr>
     <w:rPr>
-      <w:color w:val="000000" w:themeColor="text1"/>
+      <w:color w:val="2D2D2D" w:themeColor="text1"/>
     </w:rPr>
     <w:tblPr>
       <w:tblStyleRowBandSize w:val="1"/>
@@ -13762,12 +13762,12 @@
     </w:tblStylePr>
     <w:tblStylePr w:type="neCell">
       <w:rPr>
-        <w:color w:val="000000" w:themeColor="text1"/>
+        <w:color w:val="2D2D2D" w:themeColor="text1"/>
       </w:rPr>
     </w:tblStylePr>
     <w:tblStylePr w:type="nwCell">
       <w:rPr>
-        <w:color w:val="000000" w:themeColor="text1"/>
+        <w:color w:val="2D2D2D" w:themeColor="text1"/>
       </w:rPr>
     </w:tblStylePr>
   </w:style>
@@ -13780,7 +13780,7 @@
       <w:spacing w:after="0" w:line="240" w:lineRule="auto"/>
     </w:pPr>
     <w:rPr>
-      <w:color w:val="000000" w:themeColor="text1"/>
+      <w:color w:val="2D2D2D" w:themeColor="text1"/>
     </w:rPr>
     <w:tblPr>
       <w:tblStyleRowBandSize w:val="1"/>
@@ -13884,12 +13884,12 @@
     </w:tblStylePr>
     <w:tblStylePr w:type="neCell">
       <w:rPr>
-        <w:color w:val="000000" w:themeColor="text1"/>
+        <w:color w:val="2D2D2D" w:themeColor="text1"/>
       </w:rPr>
     </w:tblStylePr>
     <w:tblStylePr w:type="nwCell">
       <w:rPr>
-        <w:color w:val="000000" w:themeColor="text1"/>
+        <w:color w:val="2D2D2D" w:themeColor="text1"/>
       </w:rPr>
     </w:tblStylePr>
   </w:style>
@@ -13902,7 +13902,7 @@
       <w:spacing w:after="0" w:line="240" w:lineRule="auto"/>
     </w:pPr>
     <w:rPr>
-      <w:color w:val="000000" w:themeColor="text1"/>
+      <w:color w:val="2D2D2D" w:themeColor="text1"/>
     </w:rPr>
     <w:tblPr>
       <w:tblStyleRowBandSize w:val="1"/>
@@ -13988,7 +13988,7 @@
       <w:spacing w:after="0" w:line="240" w:lineRule="auto"/>
     </w:pPr>
     <w:rPr>
-      <w:color w:val="000000" w:themeColor="text1"/>
+      <w:color w:val="2D2D2D" w:themeColor="text1"/>
     </w:rPr>
     <w:tblPr>
       <w:tblStyleRowBandSize w:val="1"/>
@@ -14074,7 +14074,7 @@
       <w:spacing w:after="0" w:line="240" w:lineRule="auto"/>
     </w:pPr>
     <w:rPr>
-      <w:color w:val="000000" w:themeColor="text1"/>
+      <w:color w:val="2D2D2D" w:themeColor="text1"/>
     </w:rPr>
     <w:tblPr>
       <w:tblStyleRowBandSize w:val="1"/>
@@ -14160,7 +14160,7 @@
       <w:spacing w:after="0" w:line="240" w:lineRule="auto"/>
     </w:pPr>
     <w:rPr>
-      <w:color w:val="000000" w:themeColor="text1"/>
+      <w:color w:val="2D2D2D" w:themeColor="text1"/>
     </w:rPr>
     <w:tblPr>
       <w:tblStyleRowBandSize w:val="1"/>
@@ -14246,7 +14246,7 @@
       <w:spacing w:after="0" w:line="240" w:lineRule="auto"/>
     </w:pPr>
     <w:rPr>
-      <w:color w:val="000000" w:themeColor="text1"/>
+      <w:color w:val="2D2D2D" w:themeColor="text1"/>
     </w:rPr>
     <w:tblPr>
       <w:tblStyleRowBandSize w:val="1"/>
@@ -14332,7 +14332,7 @@
       <w:spacing w:after="0" w:line="240" w:lineRule="auto"/>
     </w:pPr>
     <w:rPr>
-      <w:color w:val="000000" w:themeColor="text1"/>
+      <w:color w:val="2D2D2D" w:themeColor="text1"/>
     </w:rPr>
     <w:tblPr>
       <w:tblStyleRowBandSize w:val="1"/>
@@ -14418,7 +14418,7 @@
       <w:spacing w:after="0" w:line="240" w:lineRule="auto"/>
     </w:pPr>
     <w:rPr>
-      <w:color w:val="000000" w:themeColor="text1"/>
+      <w:color w:val="2D2D2D" w:themeColor="text1"/>
     </w:rPr>
     <w:tblPr>
       <w:tblStyleRowBandSize w:val="1"/>
@@ -14504,7 +14504,7 @@
       <w:spacing w:after="0" w:line="240" w:lineRule="auto"/>
     </w:pPr>
     <w:rPr>
-      <w:color w:val="000000" w:themeColor="text1"/>
+      <w:color w:val="2D2D2D" w:themeColor="text1"/>
     </w:rPr>
     <w:tblPr>
       <w:tblStyleRowBandSize w:val="1"/>
@@ -14537,7 +14537,7 @@
       <w:rPr>
         <w:b/>
         <w:bCs/>
-        <w:color w:val="000000" w:themeColor="text1"/>
+        <w:color w:val="2D2D2D" w:themeColor="text1"/>
       </w:rPr>
       <w:tblPr/>
       <w:tcPr>
@@ -14584,7 +14584,7 @@
       <w:spacing w:after="0" w:line="240" w:lineRule="auto"/>
     </w:pPr>
     <w:rPr>
-      <w:color w:val="000000" w:themeColor="text1"/>
+      <w:color w:val="2D2D2D" w:themeColor="text1"/>
     </w:rPr>
     <w:tblPr>
       <w:tblStyleRowBandSize w:val="1"/>
@@ -14617,7 +14617,7 @@
       <w:rPr>
         <w:b/>
         <w:bCs/>
-        <w:color w:val="000000" w:themeColor="text1"/>
+        <w:color w:val="2D2D2D" w:themeColor="text1"/>
       </w:rPr>
       <w:tblPr/>
       <w:tcPr>
@@ -14664,7 +14664,7 @@
       <w:spacing w:after="0" w:line="240" w:lineRule="auto"/>
     </w:pPr>
     <w:rPr>
-      <w:color w:val="000000" w:themeColor="text1"/>
+      <w:color w:val="2D2D2D" w:themeColor="text1"/>
     </w:rPr>
     <w:tblPr>
       <w:tblStyleRowBandSize w:val="1"/>
@@ -14697,7 +14697,7 @@
       <w:rPr>
         <w:b/>
         <w:bCs/>
-        <w:color w:val="000000" w:themeColor="text1"/>
+        <w:color w:val="2D2D2D" w:themeColor="text1"/>
       </w:rPr>
       <w:tblPr/>
       <w:tcPr>
@@ -14744,7 +14744,7 @@
       <w:spacing w:after="0" w:line="240" w:lineRule="auto"/>
     </w:pPr>
     <w:rPr>
-      <w:color w:val="000000" w:themeColor="text1"/>
+      <w:color w:val="2D2D2D" w:themeColor="text1"/>
     </w:rPr>
     <w:tblPr>
       <w:tblStyleRowBandSize w:val="1"/>
@@ -14777,7 +14777,7 @@
       <w:rPr>
         <w:b/>
         <w:bCs/>
-        <w:color w:val="000000" w:themeColor="text1"/>
+        <w:color w:val="2D2D2D" w:themeColor="text1"/>
       </w:rPr>
       <w:tblPr/>
       <w:tcPr>
@@ -14824,7 +14824,7 @@
       <w:spacing w:after="0" w:line="240" w:lineRule="auto"/>
     </w:pPr>
     <w:rPr>
-      <w:color w:val="000000" w:themeColor="text1"/>
+      <w:color w:val="2D2D2D" w:themeColor="text1"/>
     </w:rPr>
     <w:tblPr>
       <w:tblStyleRowBandSize w:val="1"/>
@@ -14857,7 +14857,7 @@
       <w:rPr>
         <w:b/>
         <w:bCs/>
-        <w:color w:val="000000" w:themeColor="text1"/>
+        <w:color w:val="2D2D2D" w:themeColor="text1"/>
       </w:rPr>
       <w:tblPr/>
       <w:tcPr>
@@ -14904,7 +14904,7 @@
       <w:spacing w:after="0" w:line="240" w:lineRule="auto"/>
     </w:pPr>
     <w:rPr>
-      <w:color w:val="000000" w:themeColor="text1"/>
+      <w:color w:val="2D2D2D" w:themeColor="text1"/>
     </w:rPr>
     <w:tblPr>
       <w:tblStyleRowBandSize w:val="1"/>
@@ -14937,7 +14937,7 @@
       <w:rPr>
         <w:b/>
         <w:bCs/>
-        <w:color w:val="000000" w:themeColor="text1"/>
+        <w:color w:val="2D2D2D" w:themeColor="text1"/>
       </w:rPr>
       <w:tblPr/>
       <w:tcPr>
@@ -14984,7 +14984,7 @@
       <w:spacing w:after="0" w:line="240" w:lineRule="auto"/>
     </w:pPr>
     <w:rPr>
-      <w:color w:val="000000" w:themeColor="text1"/>
+      <w:color w:val="2D2D2D" w:themeColor="text1"/>
     </w:rPr>
     <w:tblPr>
       <w:tblStyleRowBandSize w:val="1"/>
@@ -15017,7 +15017,7 @@
       <w:rPr>
         <w:b/>
         <w:bCs/>
-        <w:color w:val="000000" w:themeColor="text1"/>
+        <w:color w:val="2D2D2D" w:themeColor="text1"/>
       </w:rPr>
       <w:tblPr/>
       <w:tcPr>
@@ -27048,7 +27048,7 @@
         <a:effectStyle>
           <a:effectLst>
             <a:outerShdw blurRad="40000" dist="20000" dir="5400000" rotWithShape="0">
-              <a:srgbClr val="000000">
+              <a:srgbClr val="2D2D2D">
                 <a:alpha val="38000"/>
               </a:srgbClr>
             </a:outerShdw>

</xml_diff>